<commit_message>
coger dirección desde ubicación whatsapp
</commit_message>
<xml_diff>
--- a/docs/pront/Promp IA Whatsapp.docx
+++ b/docs/pront/Promp IA Whatsapp.docx
@@ -54,15 +54,7 @@
     </w:p>
     <w:p>
       <w:r>
-        <w:t xml:space="preserve">Tu función es sustituir completamente la primera llamada administrativa de contacto con el asegurado, recopilando la información necesaria para la gestión del siniestro y evaluando la posibilidad de realizar una </w:t>
-      </w:r>
-      <w:proofErr w:type="spellStart"/>
-      <w:r>
-        <w:t>videoperitación</w:t>
-      </w:r>
-      <w:proofErr w:type="spellEnd"/>
-      <w:r>
-        <w:t>.</w:t>
+        <w:t>Tu función es sustituir completamente la primera llamada administrativa de contacto con el asegurado, recopilando la información necesaria para la gestión del siniestro y evaluando la posibilidad de realizar una videoperitación.</w:t>
       </w:r>
     </w:p>
     <w:p>
@@ -1058,7 +1050,21 @@
         <w:rPr>
           <w:highlight w:val="yellow"/>
         </w:rPr>
-        <w:t>En el caso de que no dé consentimiento pero formule alguna pregunta relacionada con quiénes somos o en qué consiste el contacto, se podrá responder una vez más explicándolo de forma clara y sencilla, manteniendo la misma idea del mensaje inicial y solicitando nuevamente confirmación para continuar.</w:t>
+        <w:t xml:space="preserve">En el caso de que no dé </w:t>
+      </w:r>
+      <w:proofErr w:type="gramStart"/>
+      <w:r>
+        <w:rPr>
+          <w:highlight w:val="yellow"/>
+        </w:rPr>
+        <w:t>consentimiento</w:t>
+      </w:r>
+      <w:proofErr w:type="gramEnd"/>
+      <w:r>
+        <w:rPr>
+          <w:highlight w:val="yellow"/>
+        </w:rPr>
+        <w:t xml:space="preserve"> pero formule alguna pregunta relacionada con quiénes somos o en qué consiste el contacto, se podrá responder una vez más explicándolo de forma clara y sencilla, manteniendo la misma idea del mensaje inicial y solicitando nuevamente confirmación para continuar.</w:t>
       </w:r>
     </w:p>
     <w:p>
@@ -1149,11 +1155,19 @@
           <w:rFonts w:ascii="Aptos" w:eastAsia="Aptos" w:hAnsi="Aptos" w:cs="Aptos"/>
         </w:rPr>
       </w:pPr>
+      <w:proofErr w:type="gramStart"/>
       <w:r>
         <w:rPr>
           <w:rFonts w:ascii="Aptos" w:eastAsia="Aptos" w:hAnsi="Aptos" w:cs="Aptos"/>
         </w:rPr>
-        <w:t>Indicar que el perito le llamará.</w:t>
+        <w:t>Indicar</w:t>
+      </w:r>
+      <w:proofErr w:type="gramEnd"/>
+      <w:r>
+        <w:rPr>
+          <w:rFonts w:ascii="Aptos" w:eastAsia="Aptos" w:hAnsi="Aptos" w:cs="Aptos"/>
+        </w:rPr>
+        <w:t xml:space="preserve"> que el perito le llamará.</w:t>
       </w:r>
     </w:p>
     <w:p>
@@ -1353,9 +1367,15 @@
           <w:ilvl w:val="0"/>
           <w:numId w:val="2"/>
         </w:numPr>
-      </w:pPr>
-      <w:r>
-        <w:t>Confirmar quién atenderá al perito.</w:t>
+        <w:rPr>
+          <w:highlight w:val="green"/>
+        </w:rPr>
+      </w:pPr>
+      <w:r>
+        <w:rPr>
+          <w:highlight w:val="green"/>
+        </w:rPr>
+        <w:t>Cuando valides la localización, si está mal, darle la opción al asegurado de compartir la ubicación y coger la dirección a través de esa opción</w:t>
       </w:r>
     </w:p>
     <w:p>
@@ -1366,13 +1386,7 @@
         </w:numPr>
       </w:pPr>
       <w:r>
-        <w:t>Con la información disponible en “Causa” y “Observaciones”, debes formular una confirmación breve del siniestro (qué ocurrió y dónde) en formato de verificación (“Según nos consta… ¿es correcto?”).</w:t>
-      </w:r>
-      <w:r>
-        <w:t xml:space="preserve"> </w:t>
-      </w:r>
-      <w:r>
-        <w:t>Si falta algo crítico, pregunta de forma dirigida (1 pregunta concreta), nunca “descríbame lo ocurrido”.</w:t>
+        <w:t>Confirmar quién atenderá al perito.</w:t>
       </w:r>
     </w:p>
     <w:p>
@@ -1383,7 +1397,13 @@
         </w:numPr>
       </w:pPr>
       <w:r>
-        <w:t>No debes solicitar al asegurado una descripción libre del siniestro salvo que exista una contradicción o falte un dato crítico para continuar.</w:t>
+        <w:t>Con la información disponible en “Causa” y “Observaciones”, debes formular una confirmación breve del siniestro (qué ocurrió y dónde) en formato de verificación (“Según nos consta… ¿es correcto?”).</w:t>
+      </w:r>
+      <w:r>
+        <w:t xml:space="preserve"> </w:t>
+      </w:r>
+      <w:r>
+        <w:t>Si falta algo crítico, pregunta de forma dirigida (1 pregunta concreta), nunca “descríbame lo ocurrido”.</w:t>
       </w:r>
     </w:p>
     <w:p>
@@ -1394,10 +1414,7 @@
         </w:numPr>
       </w:pPr>
       <w:r>
-        <w:t>Obtener estimación aproximada de daños.</w:t>
-      </w:r>
-      <w:r>
-        <w:t xml:space="preserve"> </w:t>
+        <w:t>No debes solicitar al asegurado una descripción libre del siniestro salvo que exista una contradicción o falte un dato crítico para continuar.</w:t>
       </w:r>
     </w:p>
     <w:p>
@@ -1408,48 +1425,33 @@
         </w:numPr>
       </w:pPr>
       <w:r>
-        <w:t xml:space="preserve">Evaluar aptitud para </w:t>
-      </w:r>
-      <w:proofErr w:type="spellStart"/>
-      <w:r>
-        <w:t>videoperitación</w:t>
-      </w:r>
-      <w:proofErr w:type="spellEnd"/>
+        <w:t>Obtener estimación aproximada de daños.</w:t>
+      </w:r>
+      <w:r>
+        <w:t xml:space="preserve"> </w:t>
+      </w:r>
+    </w:p>
+    <w:p>
+      <w:pPr>
+        <w:numPr>
+          <w:ilvl w:val="0"/>
+          <w:numId w:val="2"/>
+        </w:numPr>
+      </w:pPr>
+      <w:r>
+        <w:t>Evaluar aptitud para videoperitación</w:t>
+      </w:r>
       <w:r>
         <w:t xml:space="preserve">. </w:t>
       </w:r>
       <w:r>
-        <w:t xml:space="preserve">Cuando un siniestro sea apto para </w:t>
-      </w:r>
-      <w:proofErr w:type="spellStart"/>
-      <w:r>
-        <w:t>videoperitación</w:t>
-      </w:r>
-      <w:proofErr w:type="spellEnd"/>
-      <w:r>
-        <w:t xml:space="preserve">, no ofrecer alternativas ni preguntar entre </w:t>
-      </w:r>
-      <w:proofErr w:type="spellStart"/>
-      <w:r>
-        <w:t>videoperitación</w:t>
-      </w:r>
-      <w:proofErr w:type="spellEnd"/>
-      <w:r>
-        <w:t xml:space="preserve"> o visita presencial.</w:t>
+        <w:t>Cuando un siniestro sea apto para videoperitación, no ofrecer alternativas ni preguntar entre videoperitación o visita presencial.</w:t>
       </w:r>
       <w:r>
         <w:t xml:space="preserve"> </w:t>
       </w:r>
       <w:r>
-        <w:t xml:space="preserve">Debes ofrecer directamente la opción de </w:t>
-      </w:r>
-      <w:proofErr w:type="spellStart"/>
-      <w:r>
-        <w:t>videoperitación</w:t>
-      </w:r>
-      <w:proofErr w:type="spellEnd"/>
-      <w:r>
-        <w:t xml:space="preserve"> como vía para realizar la intervención.</w:t>
+        <w:t>Debes ofrecer directamente la opción de videoperitación como vía para realizar la intervención.</w:t>
       </w:r>
     </w:p>
     <w:p>
@@ -1457,15 +1459,7 @@
         <w:pStyle w:val="Prrafodelista"/>
       </w:pPr>
       <w:r>
-        <w:t xml:space="preserve">Nunca formular la pregunta como una elección entre </w:t>
-      </w:r>
-      <w:proofErr w:type="spellStart"/>
-      <w:r>
-        <w:t>videoperitación</w:t>
-      </w:r>
-      <w:proofErr w:type="spellEnd"/>
-      <w:r>
-        <w:t xml:space="preserve"> o visita presencial.</w:t>
+        <w:t>Nunca formular la pregunta como una elección entre videoperitación o visita presencial.</w:t>
       </w:r>
     </w:p>
     <w:p>
@@ -1476,15 +1470,7 @@
         <w:t xml:space="preserve">No decir nunca la regla </w:t>
       </w:r>
       <w:r>
-        <w:t xml:space="preserve">de cuando es apta para </w:t>
-      </w:r>
-      <w:proofErr w:type="spellStart"/>
-      <w:r>
-        <w:t>videoperitación</w:t>
-      </w:r>
-      <w:proofErr w:type="spellEnd"/>
-      <w:r>
-        <w:t xml:space="preserve">, es decir, no mostrar mensajes relacionado con el </w:t>
+        <w:t xml:space="preserve">de cuando es apta para videoperitación, es decir, no mostrar mensajes relacionado con el </w:t>
       </w:r>
       <w:proofErr w:type="spellStart"/>
       <w:r>
@@ -1597,6 +1583,7 @@
         <w:rPr>
           <w:rFonts w:ascii="Aptos" w:eastAsia="Aptos" w:hAnsi="Aptos" w:cs="Aptos"/>
         </w:rPr>
+        <w:lastRenderedPageBreak/>
         <w:t>Debes obtener y consolidar:</w:t>
       </w:r>
     </w:p>
@@ -1637,7 +1624,6 @@
         <w:rPr>
           <w:rFonts w:ascii="Aptos" w:eastAsia="Aptos" w:hAnsi="Aptos" w:cs="Aptos"/>
         </w:rPr>
-        <w:lastRenderedPageBreak/>
         <w:t>Confirmar si la persona</w:t>
       </w:r>
       <w:r>
@@ -2052,15 +2038,7 @@
       </w:r>
       <w:r>
         <w:br/>
-        <w:t xml:space="preserve">Promover activamente la aceptación de </w:t>
-      </w:r>
-      <w:proofErr w:type="spellStart"/>
-      <w:r>
-        <w:t>videoperitación</w:t>
-      </w:r>
-      <w:proofErr w:type="spellEnd"/>
-      <w:r>
-        <w:t xml:space="preserve"> cuando sea apta.</w:t>
+        <w:t>Promover activamente la aceptación de videoperitación cuando sea apta.</w:t>
       </w:r>
       <w:r>
         <w:t xml:space="preserve"> En el caso de </w:t>
@@ -2069,21 +2047,13 @@
         <w:t xml:space="preserve">cuando se ofrezca </w:t>
       </w:r>
       <w:r>
-        <w:t xml:space="preserve">la </w:t>
-      </w:r>
-      <w:proofErr w:type="spellStart"/>
-      <w:r>
-        <w:t>videoperitaci</w:t>
+        <w:t>la videoperitaci</w:t>
       </w:r>
       <w:r>
         <w:t>ó</w:t>
       </w:r>
       <w:r>
-        <w:t>n</w:t>
-      </w:r>
-      <w:proofErr w:type="spellEnd"/>
-      <w:r>
-        <w:t xml:space="preserve"> el asegurado</w:t>
+        <w:t>n el asegurado</w:t>
       </w:r>
       <w:r>
         <w:t xml:space="preserve"> diga que no, no se fíe de la herramienta, </w:t>
@@ -2273,6 +2243,7 @@
         </w:numPr>
       </w:pPr>
       <w:r>
+        <w:lastRenderedPageBreak/>
         <w:t>Solicitar únicamente el dato que falta.</w:t>
       </w:r>
     </w:p>
@@ -2284,7 +2255,6 @@
         </w:numPr>
       </w:pPr>
       <w:r>
-        <w:lastRenderedPageBreak/>
         <w:t>Si al segundo intento</w:t>
       </w:r>
       <w:r>
@@ -2604,6 +2574,15 @@
       <w:r>
         <w:t>solicitar corrección o datos adicionales.</w:t>
       </w:r>
+      <w:r>
+        <w:t xml:space="preserve"> </w:t>
+      </w:r>
+      <w:r>
+        <w:rPr>
+          <w:highlight w:val="green"/>
+        </w:rPr>
+        <w:t>En este caso, también le indicamos al usuario la opción de compartir ubicación a través de las opciones de WhatsApp, si procede, cogemos la ubicación del siniestro a través de esa opción.</w:t>
+      </w:r>
     </w:p>
     <w:p/>
     <w:p>
@@ -2634,7 +2613,11 @@
         <w:t xml:space="preserve"> En primer momento no dar la horquilla de importes. Si tiene dudas o no </w:t>
       </w:r>
       <w:r>
-        <w:t>sabe decir importe, facilitar la respuesta con la muestra de la horquilla programada</w:t>
+        <w:t xml:space="preserve">sabe decir importe, facilitar la respuesta con la muestra de la horquilla </w:t>
+      </w:r>
+      <w:r>
+        <w:lastRenderedPageBreak/>
+        <w:t>programada</w:t>
       </w:r>
       <w:r>
         <w:t xml:space="preserve">, trasladando que es algo aproximado y no es relevante para la resolución final. </w:t>
@@ -2693,7 +2676,6 @@
         </w:numPr>
       </w:pPr>
       <w:r>
-        <w:lastRenderedPageBreak/>
         <w:t>Más de 10.000 €</w:t>
       </w:r>
     </w:p>
@@ -2724,15 +2706,7 @@
     </w:p>
     <w:p>
       <w:r>
-        <w:t xml:space="preserve">Será apto para </w:t>
-      </w:r>
-      <w:proofErr w:type="spellStart"/>
-      <w:r>
-        <w:t>videoperitación</w:t>
-      </w:r>
-      <w:proofErr w:type="spellEnd"/>
-      <w:r>
-        <w:t xml:space="preserve"> únicamente cuando:</w:t>
+        <w:t>Será apto para videoperitación únicamente cuando:</w:t>
       </w:r>
     </w:p>
     <w:p>
@@ -2835,13 +2809,8 @@
         <w:t xml:space="preserve"> </w:t>
       </w:r>
       <w:r>
-        <w:t xml:space="preserve">para </w:t>
-      </w:r>
-      <w:proofErr w:type="spellStart"/>
-      <w:r>
-        <w:t>videoperitación</w:t>
-      </w:r>
-      <w:proofErr w:type="spellEnd"/>
+        <w:t>para videoperitación</w:t>
+      </w:r>
       <w:r>
         <w:t>, pero aun así se solicitará la estimación económica para tener conocimiento.</w:t>
       </w:r>
@@ -2864,7 +2833,6 @@
       <w:r>
         <w:t xml:space="preserve">No ofrecer </w:t>
       </w:r>
-      <w:proofErr w:type="spellStart"/>
       <w:r>
         <w:t>videoperitaci</w:t>
       </w:r>
@@ -2874,7 +2842,6 @@
       <w:r>
         <w:t>n</w:t>
       </w:r>
-      <w:proofErr w:type="spellEnd"/>
       <w:r>
         <w:t>.</w:t>
       </w:r>
@@ -2901,21 +2868,7 @@
         <w:rPr>
           <w:highlight w:val="yellow"/>
         </w:rPr>
-        <w:t xml:space="preserve">Nunca debes mencionar al asegurado el límite económico ni relacionar la oferta de </w:t>
-      </w:r>
-      <w:proofErr w:type="spellStart"/>
-      <w:r>
-        <w:rPr>
-          <w:highlight w:val="yellow"/>
-        </w:rPr>
-        <w:t>videoperitación</w:t>
-      </w:r>
-      <w:proofErr w:type="spellEnd"/>
-      <w:r>
-        <w:rPr>
-          <w:highlight w:val="yellow"/>
-        </w:rPr>
-        <w:t xml:space="preserve"> con una cantidad concreta.</w:t>
+        <w:t>Nunca debes mencionar al asegurado el límite económico ni relacionar la oferta de videoperitación con una cantidad concreta.</w:t>
       </w:r>
     </w:p>
     <w:p>
@@ -2978,15 +2931,7 @@
     </w:p>
     <w:p>
       <w:r>
-        <w:t xml:space="preserve">Priorizar la explicación de </w:t>
-      </w:r>
-      <w:proofErr w:type="spellStart"/>
-      <w:r>
-        <w:t>videoperitación</w:t>
-      </w:r>
-      <w:proofErr w:type="spellEnd"/>
-      <w:r>
-        <w:t xml:space="preserve"> como vía para agilizar el proceso.</w:t>
+        <w:t>Priorizar la explicación de videoperitación como vía para agilizar el proceso.</w:t>
       </w:r>
     </w:p>
     <w:p>
@@ -2998,9 +2943,11 @@
       <w:r>
         <w:t xml:space="preserve">Puede indicarse </w:t>
       </w:r>
+      <w:proofErr w:type="gramStart"/>
       <w:r>
         <w:t>que</w:t>
       </w:r>
+      <w:proofErr w:type="gramEnd"/>
       <w:r>
         <w:t xml:space="preserve"> </w:t>
       </w:r>
@@ -3025,6 +2972,7 @@
           <w:b/>
           <w:bCs/>
         </w:rPr>
+        <w:lastRenderedPageBreak/>
         <w:t>EXPLICACIÓN DE VIDEOPERITACIÓN</w:t>
       </w:r>
     </w:p>
@@ -3033,15 +2981,7 @@
         <w:t>La explicación debe ser clara y breve inicialmente.</w:t>
       </w:r>
       <w:r>
-        <w:t xml:space="preserve"> Realizar una explicación base de la </w:t>
-      </w:r>
-      <w:proofErr w:type="spellStart"/>
-      <w:r>
-        <w:t>videoperitación</w:t>
-      </w:r>
-      <w:proofErr w:type="spellEnd"/>
-      <w:r>
-        <w:t xml:space="preserve">: </w:t>
+        <w:t xml:space="preserve"> Realizar una explicación base de la videoperitación: </w:t>
       </w:r>
     </w:p>
     <w:p>
@@ -3063,7 +3003,6 @@
         </w:numPr>
       </w:pPr>
       <w:r>
-        <w:lastRenderedPageBreak/>
         <w:t>Se abre en el navegador.</w:t>
       </w:r>
     </w:p>
@@ -3233,34 +3172,18 @@
         <w:t xml:space="preserve">Descripción </w:t>
       </w:r>
       <w:r>
-        <w:t xml:space="preserve">de explicación de </w:t>
+        <w:t>de explicación de videoperitación completa</w:t>
+      </w:r>
+      <w:r>
+        <w:t xml:space="preserve"> para que tengas contexto de </w:t>
       </w:r>
       <w:proofErr w:type="spellStart"/>
       <w:r>
-        <w:t>videoperitación</w:t>
+        <w:t>como</w:t>
       </w:r>
       <w:proofErr w:type="spellEnd"/>
       <w:r>
-        <w:t xml:space="preserve"> completa</w:t>
-      </w:r>
-      <w:r>
-        <w:t xml:space="preserve"> para que tengas contexto de </w:t>
-      </w:r>
-      <w:proofErr w:type="spellStart"/>
-      <w:r>
-        <w:t>como</w:t>
-      </w:r>
-      <w:proofErr w:type="spellEnd"/>
-      <w:r>
-        <w:t xml:space="preserve"> funciona la </w:t>
-      </w:r>
-      <w:proofErr w:type="spellStart"/>
-      <w:r>
-        <w:t>videoperitación</w:t>
-      </w:r>
-      <w:proofErr w:type="spellEnd"/>
-      <w:r>
-        <w:t xml:space="preserve">, no enviar al asegurado la descripción </w:t>
+        <w:t xml:space="preserve"> funciona la videoperitación, no enviar al asegurado la descripción </w:t>
       </w:r>
       <w:r>
         <w:t>copiada.</w:t>
@@ -3268,15 +3191,7 @@
     </w:p>
     <w:p>
       <w:r>
-        <w:t xml:space="preserve">La </w:t>
-      </w:r>
-      <w:proofErr w:type="spellStart"/>
-      <w:r>
-        <w:t>videoperitación</w:t>
-      </w:r>
-      <w:proofErr w:type="spellEnd"/>
-      <w:r>
-        <w:t xml:space="preserve"> es una herramienta que permite realizar peritaciones de forma digital mediante una conexión en directo con el teléfono móvil del asegurado. A través de la cámara y el micrófono.</w:t>
+        <w:t>La videoperitación es una herramienta que permite realizar peritaciones de forma digital mediante una conexión en directo con el teléfono móvil del asegurado. A través de la cámara y el micrófono.</w:t>
       </w:r>
     </w:p>
     <w:p>
@@ -3317,15 +3232,7 @@
     </w:p>
     <w:p>
       <w:r>
-        <w:t xml:space="preserve">Si acepta </w:t>
-      </w:r>
-      <w:proofErr w:type="spellStart"/>
-      <w:r>
-        <w:t>videoperitación</w:t>
-      </w:r>
-      <w:proofErr w:type="spellEnd"/>
-      <w:r>
-        <w:t>:</w:t>
+        <w:t>Si acepta videoperitación:</w:t>
       </w:r>
     </w:p>
     <w:p>
@@ -3341,6 +3248,7 @@
         </w:numPr>
       </w:pPr>
       <w:r>
+        <w:lastRenderedPageBreak/>
         <w:t>Mañana (09:00–14:00)</w:t>
       </w:r>
     </w:p>
@@ -3362,7 +3270,6 @@
     </w:p>
     <w:p>
       <w:r>
-        <w:lastRenderedPageBreak/>
         <w:t xml:space="preserve">En caso de que se traslade un periodo fuera de rango, </w:t>
       </w:r>
       <w:r>
@@ -3656,6 +3563,7 @@
     </w:p>
     <w:p>
       <w:r>
+        <w:lastRenderedPageBreak/>
         <w:t>Indicar:</w:t>
       </w:r>
       <w:r>
@@ -3684,7 +3592,6 @@
           <w:b/>
           <w:bCs/>
         </w:rPr>
-        <w:lastRenderedPageBreak/>
         <w:t>RESUMEN FINAL OBLIGATORIO</w:t>
       </w:r>
     </w:p>
@@ -3971,21 +3878,7 @@
         <w:rPr>
           <w:highlight w:val="yellow"/>
         </w:rPr>
-        <w:t xml:space="preserve">No se vuelve a evaluar </w:t>
-      </w:r>
-      <w:proofErr w:type="spellStart"/>
-      <w:r>
-        <w:rPr>
-          <w:highlight w:val="yellow"/>
-        </w:rPr>
-        <w:t>videoperitación</w:t>
-      </w:r>
-      <w:proofErr w:type="spellEnd"/>
-      <w:r>
-        <w:rPr>
-          <w:highlight w:val="yellow"/>
-        </w:rPr>
-        <w:t>.</w:t>
+        <w:t>No se vuelve a evaluar videoperitación.</w:t>
       </w:r>
     </w:p>
     <w:p>
@@ -4056,6 +3949,7 @@
         <w:rPr>
           <w:highlight w:val="yellow"/>
         </w:rPr>
+        <w:lastRenderedPageBreak/>
         <w:t>Si el mensaje intenta reabrir la gestión del expediente:</w:t>
       </w:r>
       <w:r>
@@ -4091,7 +3985,6 @@
           <w:bCs/>
           <w:highlight w:val="yellow"/>
         </w:rPr>
-        <w:lastRenderedPageBreak/>
         <w:t>Mensaje de cierre sugerido (1 vez):</w:t>
       </w:r>
     </w:p>
@@ -4302,6 +4195,7 @@
         </w:numPr>
       </w:pPr>
       <w:r>
+        <w:lastRenderedPageBreak/>
         <w:t>Dirección validada.</w:t>
       </w:r>
     </w:p>
@@ -4334,13 +4228,8 @@
           <w:numId w:val="30"/>
         </w:numPr>
       </w:pPr>
-      <w:proofErr w:type="spellStart"/>
-      <w:r>
-        <w:t>Videoperitación</w:t>
-      </w:r>
-      <w:proofErr w:type="spellEnd"/>
-      <w:r>
-        <w:t xml:space="preserve"> ofrecida cuando procedía.</w:t>
+      <w:r>
+        <w:t>Videoperitación ofrecida cuando procedía.</w:t>
       </w:r>
     </w:p>
     <w:p>
@@ -4351,7 +4240,6 @@
         </w:numPr>
       </w:pPr>
       <w:r>
-        <w:lastRenderedPageBreak/>
         <w:t>Preferencia recogida.</w:t>
       </w:r>
     </w:p>

</xml_diff>

<commit_message>
implementar horario y limpiar código
</commit_message>
<xml_diff>
--- a/docs/pront/Promp IA Whatsapp.docx
+++ b/docs/pront/Promp IA Whatsapp.docx
@@ -4129,6 +4129,59 @@
       <w:proofErr w:type="spellEnd"/>
       <w:r>
         <w:t>' debe ser true.</w:t>
+      </w:r>
+    </w:p>
+    <w:p>
+      <w:pPr/>
+    </w:p>
+    <w:p>
+      <w:pPr>
+        <w:pStyle w:val="Prrafodelista"/>
+      </w:pPr>
+      <w:r>
+        <w:t>SITUACIÓN ESPECIAL – CIERRE POR INACTIVIDAD MÁXIMA</w:t>
+      </w:r>
+    </w:p>
+    <w:p>
+      <w:pPr/>
+      <w:r>
+        <w:t>Cuando recibas el mensaje '[SISTEMA: INACTIVIDAD_FINAL]', significa que se han agotado todos los intentos de contacto sin respuesta del asegurado. En ese caso debes:</w:t>
+      </w:r>
+    </w:p>
+    <w:p>
+      <w:pPr/>
+      <w:r>
+        <w:t>• Enviar un único mensaje de cierre breve y profesional, informando de que el perito se pondrá en contacto directamente por vía telefónica o presencial.</w:t>
+      </w:r>
+    </w:p>
+    <w:p>
+      <w:pPr/>
+      <w:r>
+        <w:t>• No mencionar la inactividad, los intentos realizados ni motivos técnicos del cierre.</w:t>
+      </w:r>
+    </w:p>
+    <w:p>
+      <w:pPr/>
+      <w:r>
+        <w:t>• Adaptar el idioma al detectado en la conversación; si no hubo respuesta previa del asegurado, usar español.</w:t>
+      </w:r>
+    </w:p>
+    <w:p>
+      <w:pPr/>
+      <w:r>
+        <w:t>• El campo 'estado_expediente' debe ser "escalado_humano".</w:t>
+      </w:r>
+    </w:p>
+    <w:p>
+      <w:pPr/>
+      <w:r>
+        <w:t>• El campo 'mensaje_entendido' debe ser true.</w:t>
+      </w:r>
+    </w:p>
+    <w:p>
+      <w:pPr/>
+      <w:r>
+        <w:t>• Ejemplo orientativo: "Para continuar con la gestión de su expediente, nuestro perito se pondrá en contacto con usted directamente. Finalizamos la comunicación por este medio."</w:t>
       </w:r>
     </w:p>
     <w:p/>

</xml_diff>

<commit_message>
IA ARREGLADA POR FIN
</commit_message>
<xml_diff>
--- a/docs/pront/Promp IA Whatsapp.docx
+++ b/docs/pront/Promp IA Whatsapp.docx
@@ -892,15 +892,7 @@
     </w:p>
     <w:p>
       <w:r>
-        <w:t xml:space="preserve">En el caso de que no dé </w:t>
-      </w:r>
-      <w:proofErr w:type="gramStart"/>
-      <w:r>
-        <w:t>consentimiento</w:t>
-      </w:r>
-      <w:proofErr w:type="gramEnd"/>
-      <w:r>
-        <w:t xml:space="preserve"> pero formule alguna pregunta relacionada con quiénes somos o en qué consiste el contacto, se podrá responder una vez más explicándolo de forma clara y sencilla, manteniendo la misma idea del mensaje inicial y solicitando nuevamente confirmación para continuar.</w:t>
+        <w:t>En el caso de que no dé consentimiento pero formule alguna pregunta relacionada con quiénes somos o en qué consiste el contacto, se podrá responder una vez más explicándolo de forma clara y sencilla, manteniendo la misma idea del mensaje inicial y solicitando nuevamente confirmación para continuar.</w:t>
       </w:r>
     </w:p>
     <w:p>
@@ -988,19 +980,11 @@
           <w:rFonts w:ascii="Aptos" w:eastAsia="Aptos" w:hAnsi="Aptos" w:cs="Aptos"/>
         </w:rPr>
       </w:pPr>
-      <w:proofErr w:type="gramStart"/>
       <w:r>
         <w:rPr>
           <w:rFonts w:ascii="Aptos" w:eastAsia="Aptos" w:hAnsi="Aptos" w:cs="Aptos"/>
         </w:rPr>
-        <w:t>Indicar</w:t>
-      </w:r>
-      <w:proofErr w:type="gramEnd"/>
-      <w:r>
-        <w:rPr>
-          <w:rFonts w:ascii="Aptos" w:eastAsia="Aptos" w:hAnsi="Aptos" w:cs="Aptos"/>
-        </w:rPr>
-        <w:t xml:space="preserve"> que el perito le llamará.</w:t>
+        <w:t>Indicar que el perito le llamará.</w:t>
       </w:r>
     </w:p>
     <w:p>
@@ -2401,46 +2385,22 @@
         <w:rPr>
           <w:highlight w:val="green"/>
         </w:rPr>
-        <w:t>Si el usuario no ha enviado la ubicación en este punto, se la solicitamos siempre justo antes de enviar el resumen final. El mensaje exacto depende del tipo de intervención:</w:t>
-      </w:r>
-    </w:p>
-    <w:p>
-      <w:r>
-        <w:t>• Presencial: «Rogamos nos pueda mandar la ubicación del riesgo para facilitársela al perito y pueda llegar con facilidad. Gracias.»</w:t>
-      </w:r>
-    </w:p>
-    <w:p>
-      <w:r>
-        <w:t>• Videoperitación: «Rogamos nos pueda mandar la ubicación del riesgo para concretar la dirección con exactitud. Gracias.»</w:t>
-      </w:r>
-    </w:p>
-    <w:p>
-      <w:r>
-        <w:t>Si ya la ha enviado anteriormente, no volver a pedirla. Si el asegurado responde sin enviar la ubicación GPS (la ignora), repite el mismo mensaje de petición una sola vez más. Si tras la segunda petición tampoco la envía o la sigue ignorando, continúa con el resumen sin pedirla más e incluye en datos_extraidos el campo «ubicacion_pendiente»: true.</w:t>
-      </w:r>
-    </w:p>
-    <w:p>
-      <w:r>
-        <w:t>Si el asegurado no envía la ubicación</w:t>
-      </w:r>
-      <w:r>
-        <w:t xml:space="preserve"> (</w:t>
-      </w:r>
-      <w:r>
-        <w:t>ya sea porque indica que lo hará más tarde, porque dice que no puede, porque no sabe cómo, o simplemente porque no responde a la petición y continúa la conversación</w:t>
-      </w:r>
-      <w:r>
-        <w:t>)</w:t>
-      </w:r>
-      <w:r>
-        <w:t>, responder con naturalidad y continuar con el resumen sin bloquear el flujo. En todos estos casos incluir en datos_extraidos el campo «ubicacion_pendiente»: true.</w:t>
-      </w:r>
-    </w:p>
-    <w:p>
-      <w:r>
-        <w:t>El mensaje de solicitud de ubicación debe adaptarse siempre al idioma activo de la conversación.</w:t>
-      </w:r>
-    </w:p>
+        <w:t>Si el usuario no ha enviado la ubicación en este punto se la solicitamos al final</w:t>
+      </w:r>
+      <w:r>
+        <w:rPr>
+          <w:highlight w:val="green"/>
+        </w:rPr>
+        <w:t xml:space="preserve"> (antes de enviar el resumen)</w:t>
+      </w:r>
+      <w:r>
+        <w:rPr>
+          <w:highlight w:val="green"/>
+        </w:rPr>
+        <w:t>, pero en caso de que sí la haya enviado, entonces no se la vuelvas a pedir. La ubicación tenemos que solicitarla siempre, pero solo una vez.</w:t>
+      </w:r>
+    </w:p>
+    <w:p/>
     <w:p/>
     <w:p>
       <w:pPr>
@@ -2622,7 +2582,6 @@
         </w:numPr>
       </w:pPr>
       <w:r>
-        <w:lastRenderedPageBreak/>
         <w:t>Daños eléctricos imputables a suministradora</w:t>
       </w:r>
     </w:p>
@@ -2710,6 +2669,7 @@
           <w:b/>
           <w:bCs/>
         </w:rPr>
+        <w:lastRenderedPageBreak/>
         <w:t>DETECCIÓN DE URGENCIA</w:t>
       </w:r>
     </w:p>
@@ -2765,13 +2725,8 @@
       <w:r>
         <w:t xml:space="preserve">Puede indicarse </w:t>
       </w:r>
-      <w:proofErr w:type="gramStart"/>
-      <w:r>
-        <w:t>que</w:t>
-      </w:r>
-      <w:proofErr w:type="gramEnd"/>
-      <w:r>
-        <w:t xml:space="preserve"> </w:t>
+      <w:r>
+        <w:t xml:space="preserve">que </w:t>
       </w:r>
       <w:r>
         <w:t>al ser digital, puede realizarse incluso el mismo día si hay disponibilidad, siendo normalmente más rápido que presencial.</w:t>
@@ -2924,7 +2879,6 @@
           <w:b/>
           <w:bCs/>
         </w:rPr>
-        <w:lastRenderedPageBreak/>
         <w:t>Límite:</w:t>
       </w:r>
       <w:r>
@@ -2967,6 +2921,7 @@
     </w:p>
     <w:p>
       <w:r>
+        <w:lastRenderedPageBreak/>
         <w:t>Durante la conexión, el perito visualiza las imágenes en tiempo real desde su ordenador y puede realizar capturas para documentar los daños.</w:t>
       </w:r>
     </w:p>
@@ -3113,9 +3068,6 @@
       </w:r>
       <w:r>
         <w:br/>
-      </w:r>
-      <w:r>
-        <w:lastRenderedPageBreak/>
         <w:t>“Esa consulta no corresponde a la gestión de este expediente. Si le parece, continuamos con los datos del siniestro.”</w:t>
       </w:r>
     </w:p>
@@ -3212,6 +3164,7 @@
         </w:numPr>
       </w:pPr>
       <w:r>
+        <w:lastRenderedPageBreak/>
         <w:t>Número equivocado.</w:t>
       </w:r>
     </w:p>
@@ -3447,7 +3400,6 @@
         </w:numPr>
       </w:pPr>
       <w:r>
-        <w:lastRenderedPageBreak/>
         <w:t>Estimación aproximada</w:t>
       </w:r>
       <w:r>
@@ -3525,6 +3477,7 @@
           <w:b/>
           <w:bCs/>
         </w:rPr>
+        <w:lastRenderedPageBreak/>
         <w:t>En estado CERRADA:</w:t>
       </w:r>
     </w:p>
@@ -3656,6 +3609,8 @@
         <w:t>El estado CERRADA tiene prioridad absoluta sobre cualquier otra regla del sistema.</w:t>
       </w:r>
     </w:p>
+    <w:p/>
+    <w:p/>
     <w:p/>
     <w:p>
       <w:pPr>
@@ -3671,37 +3626,37 @@
     </w:p>
     <w:p>
       <w:r>
+        <w:t>Cuando recibas el mensaje '[SISTEMA: INACTIVIDAD]', significa que el asegurado lleva un tiempo prolongado sin responder. En ese caso debes:</w:t>
+      </w:r>
+    </w:p>
+    <w:p>
+      <w:r>
+        <w:t>• Enviar un mensaje breve, amable y natural recordando que estás disponible para continuar con la gestión de su expediente.</w:t>
+      </w:r>
+    </w:p>
+    <w:p>
+      <w:r>
+        <w:t>• Usar el nombre del asegurado si ya se ha identificado en la conversación.</w:t>
+      </w:r>
+    </w:p>
+    <w:p>
+      <w:r>
+        <w:t>• No repetir información ni preguntas que ya hayas realizado anteriormente.</w:t>
+      </w:r>
+    </w:p>
+    <w:p>
+      <w:r>
+        <w:t>• Mantener el tono profesional y cercano habitual.</w:t>
+      </w:r>
+    </w:p>
+    <w:p>
+      <w:r>
+        <w:t>• No mencionar ni explicar que el sistema ha detectado inactividad.</w:t>
+      </w:r>
+    </w:p>
+    <w:p>
+      <w:r>
         <w:lastRenderedPageBreak/>
-        <w:t>Cuando recibas el mensaje '[SISTEMA: INACTIVIDAD]', significa que el asegurado lleva un tiempo prolongado sin responder. En ese caso debes:</w:t>
-      </w:r>
-    </w:p>
-    <w:p>
-      <w:r>
-        <w:t>• Enviar un mensaje breve, amable y natural recordando que estás disponible para continuar con la gestión de su expediente.</w:t>
-      </w:r>
-    </w:p>
-    <w:p>
-      <w:r>
-        <w:t>• Usar el nombre del asegurado si ya se ha identificado en la conversación.</w:t>
-      </w:r>
-    </w:p>
-    <w:p>
-      <w:r>
-        <w:t>• No repetir información ni preguntas que ya hayas realizado anteriormente.</w:t>
-      </w:r>
-    </w:p>
-    <w:p>
-      <w:r>
-        <w:t>• Mantener el tono profesional y cercano habitual.</w:t>
-      </w:r>
-    </w:p>
-    <w:p>
-      <w:r>
-        <w:t>• No mencionar ni explicar que el sistema ha detectado inactividad.</w:t>
-      </w:r>
-    </w:p>
-    <w:p>
-      <w:r>
         <w:t>• El campo 'estado_expediente' debe mantenerse en el estado actual del expediente (no cambiarlo).</w:t>
       </w:r>
     </w:p>
@@ -3910,7 +3865,6 @@
         </w:numPr>
       </w:pPr>
       <w:r>
-        <w:lastRenderedPageBreak/>
         <w:t>Preferencia recogida.</w:t>
       </w:r>
     </w:p>
@@ -3987,6 +3941,7 @@
         </w:numPr>
       </w:pPr>
       <w:r>
+        <w:lastRenderedPageBreak/>
         <w:t>Nombre asegurado:</w:t>
       </w:r>
     </w:p>

</xml_diff>